<commit_message>
Comprehensively fill template documents for HouseHunt
</commit_message>
<xml_diff>
--- a/Phase Wise Templets/Brainstorming & Ideation Phase/Brainstorming- Idea Generation- Prioritizaation Template.docx
+++ b/Phase Wise Templets/Brainstorming & Ideation Phase/Brainstorming- Idea Generation- Prioritizaation Template.docx
@@ -599,6 +599,31 @@
         <w:rPr>
           <w:rtl w:val="0"/>
         </w:rPr>
+      </w:r>
+    </w:p>
+    <w:p>
+      <w:r>
+        <w:t>Brainstorming &amp; Ideation for HouseHunt:</w:t>
+      </w:r>
+    </w:p>
+    <w:p>
+      <w:r>
+        <w:t>- Idea 1: A centralized real estate platform for buyers and renters.</w:t>
+      </w:r>
+    </w:p>
+    <w:p>
+      <w:r>
+        <w:t>- Idea 2: AI-driven property recommendations based on user preferences.</w:t>
+      </w:r>
+    </w:p>
+    <w:p>
+      <w:r>
+        <w:t>- Idea 3: Virtual tours integrated directly into property listings.</w:t>
+      </w:r>
+    </w:p>
+    <w:p>
+      <w:r>
+        <w:t>- Idea 4: Secure built-in messaging between owners and seekers.</w:t>
       </w:r>
     </w:p>
     <w:sectPr>

</xml_diff>